<commit_message>
fix: service and equipaent placeholders
</commit_message>
<xml_diff>
--- a/Modelos/definitivos/Modelo - RCPU.docx
+++ b/Modelos/definitivos/Modelo - RCPU.docx
@@ -118,16 +118,14 @@
               </w:rPr>
               <w:t>{{</w:t>
             </w:r>
-            <w:proofErr w:type="spellStart"/>
-            <w:r>
-              <w:rPr>
-                <w:color w:val="11437E"/>
-                <w:sz w:val="18"/>
-                <w:szCs w:val="18"/>
-              </w:rPr>
-              <w:t>equipament</w:t>
-            </w:r>
-            <w:proofErr w:type="spellEnd"/>
+            <w:r>
+              <w:rPr>
+                <w:color w:val="11437E"/>
+                <w:sz w:val="18"/>
+                <w:szCs w:val="18"/>
+              </w:rPr>
+              <w:t>service</w:t>
+            </w:r>
             <w:r>
               <w:rPr>
                 <w:color w:val="11437E"/>
@@ -192,7 +190,6 @@
               </w:rPr>
               <w:t>{{</w:t>
             </w:r>
-            <w:proofErr w:type="spellStart"/>
             <w:r>
               <w:rPr>
                 <w:color w:val="11437E"/>
@@ -201,7 +198,6 @@
               </w:rPr>
               <w:t>oil</w:t>
             </w:r>
-            <w:proofErr w:type="spellEnd"/>
             <w:r>
               <w:rPr>
                 <w:color w:val="11437E"/>
@@ -257,7 +253,6 @@
               </w:rPr>
               <w:t>{{</w:t>
             </w:r>
-            <w:proofErr w:type="spellStart"/>
             <w:r>
               <w:rPr>
                 <w:color w:val="11437E"/>
@@ -266,7 +261,6 @@
               </w:rPr>
               <w:t>flushingunit</w:t>
             </w:r>
-            <w:proofErr w:type="spellEnd"/>
             <w:r>
               <w:rPr>
                 <w:color w:val="11437E"/>
@@ -332,7 +326,6 @@
               </w:rPr>
               <w:t>{{</w:t>
             </w:r>
-            <w:proofErr w:type="spellStart"/>
             <w:r>
               <w:rPr>
                 <w:color w:val="11437E"/>
@@ -341,7 +334,6 @@
               </w:rPr>
               <w:t>servicelist</w:t>
             </w:r>
-            <w:proofErr w:type="spellEnd"/>
             <w:r>
               <w:rPr>
                 <w:color w:val="11437E"/>
@@ -388,7 +380,23 @@
                 <w:sz w:val="18"/>
                 <w:szCs w:val="18"/>
               </w:rPr>
-              <w:t>{{equipamento}}</w:t>
+              <w:t>{{</w:t>
+            </w:r>
+            <w:r>
+              <w:rPr>
+                <w:color w:val="11437E"/>
+                <w:sz w:val="18"/>
+                <w:szCs w:val="18"/>
+              </w:rPr>
+              <w:t>equipament</w:t>
+            </w:r>
+            <w:r>
+              <w:rPr>
+                <w:color w:val="11437E"/>
+                <w:sz w:val="18"/>
+                <w:szCs w:val="18"/>
+              </w:rPr>
+              <w:t>}}</w:t>
             </w:r>
           </w:p>
         </w:tc>
@@ -500,7 +508,6 @@
               </w:rPr>
               <w:t>{{</w:t>
             </w:r>
-            <w:proofErr w:type="spellStart"/>
             <w:r>
               <w:rPr>
                 <w:color w:val="11437E"/>
@@ -509,7 +516,6 @@
               </w:rPr>
               <w:t>thermounit</w:t>
             </w:r>
-            <w:proofErr w:type="spellEnd"/>
             <w:r>
               <w:rPr>
                 <w:color w:val="11437E"/>
@@ -573,7 +579,6 @@
               </w:rPr>
               <w:t>{{</w:t>
             </w:r>
-            <w:proofErr w:type="spellStart"/>
             <w:r>
               <w:rPr>
                 <w:color w:val="11437E"/>
@@ -582,7 +587,6 @@
               </w:rPr>
               <w:t>particlecounterserial</w:t>
             </w:r>
-            <w:proofErr w:type="spellEnd"/>
             <w:r>
               <w:rPr>
                 <w:color w:val="11437E"/>
@@ -718,23 +722,13 @@
               </w:rPr>
               <w:t>{{</w:t>
             </w:r>
-            <w:proofErr w:type="spellStart"/>
-            <w:r>
-              <w:rPr>
-                <w:color w:val="11437E"/>
-                <w:sz w:val="18"/>
-                <w:szCs w:val="18"/>
-              </w:rPr>
-              <w:t>starttime</w:t>
-            </w:r>
-            <w:proofErr w:type="spellEnd"/>
-            <w:r>
-              <w:rPr>
-                <w:color w:val="11437E"/>
-                <w:sz w:val="18"/>
-                <w:szCs w:val="18"/>
-              </w:rPr>
-              <w:t>}</w:t>
+            <w:r>
+              <w:rPr>
+                <w:color w:val="11437E"/>
+                <w:sz w:val="18"/>
+                <w:szCs w:val="18"/>
+              </w:rPr>
+              <w:t>starttime}</w:t>
             </w:r>
             <w:r>
               <w:rPr>
@@ -792,7 +786,6 @@
               </w:rPr>
               <w:t>{{</w:t>
             </w:r>
-            <w:proofErr w:type="spellStart"/>
             <w:r>
               <w:rPr>
                 <w:color w:val="11437E"/>
@@ -801,7 +794,6 @@
               </w:rPr>
               <w:t>endtime</w:t>
             </w:r>
-            <w:proofErr w:type="spellEnd"/>
             <w:r>
               <w:rPr>
                 <w:color w:val="11437E"/>
@@ -838,51 +830,22 @@
                 <w:szCs w:val="18"/>
               </w:rPr>
             </w:pPr>
-            <w:proofErr w:type="spellStart"/>
-            <w:r>
-              <w:rPr>
-                <w:b/>
-                <w:bCs/>
-                <w:sz w:val="18"/>
-                <w:szCs w:val="18"/>
-              </w:rPr>
-              <w:t>Tags</w:t>
-            </w:r>
-            <w:proofErr w:type="spellEnd"/>
-            <w:r>
-              <w:rPr>
-                <w:b/>
-                <w:bCs/>
-                <w:sz w:val="18"/>
-                <w:szCs w:val="18"/>
-              </w:rPr>
-              <w:t xml:space="preserve">: </w:t>
-            </w:r>
-            <w:r>
-              <w:rPr>
-                <w:color w:val="11437E"/>
-                <w:sz w:val="18"/>
-                <w:szCs w:val="18"/>
-              </w:rPr>
-              <w:t>{{</w:t>
-            </w:r>
-            <w:proofErr w:type="spellStart"/>
-            <w:r>
-              <w:rPr>
-                <w:color w:val="11437E"/>
-                <w:sz w:val="18"/>
-                <w:szCs w:val="18"/>
-              </w:rPr>
-              <w:t>tags</w:t>
-            </w:r>
-            <w:proofErr w:type="spellEnd"/>
-            <w:r>
-              <w:rPr>
-                <w:color w:val="11437E"/>
-                <w:sz w:val="18"/>
-                <w:szCs w:val="18"/>
-              </w:rPr>
-              <w:t>}}</w:t>
+            <w:r>
+              <w:rPr>
+                <w:b/>
+                <w:bCs/>
+                <w:sz w:val="18"/>
+                <w:szCs w:val="18"/>
+              </w:rPr>
+              <w:t xml:space="preserve">Tags: </w:t>
+            </w:r>
+            <w:r>
+              <w:rPr>
+                <w:color w:val="11437E"/>
+                <w:sz w:val="18"/>
+                <w:szCs w:val="18"/>
+              </w:rPr>
+              <w:t>{{tags}}</w:t>
             </w:r>
           </w:p>
         </w:tc>
@@ -1043,25 +1006,7 @@
                 <w:sz w:val="18"/>
                 <w:szCs w:val="18"/>
               </w:rPr>
-              <w:t>{{</w:t>
-            </w:r>
-            <w:proofErr w:type="spellStart"/>
-            <w:r>
-              <w:rPr>
-                <w:color w:val="11437E"/>
-                <w:sz w:val="18"/>
-                <w:szCs w:val="18"/>
-              </w:rPr>
-              <w:t>diameter</w:t>
-            </w:r>
-            <w:proofErr w:type="spellEnd"/>
-            <w:r>
-              <w:rPr>
-                <w:color w:val="11437E"/>
-                <w:sz w:val="18"/>
-                <w:szCs w:val="18"/>
-              </w:rPr>
-              <w:t>}}</w:t>
+              <w:t>{{diameter}}</w:t>
             </w:r>
           </w:p>
         </w:tc>
@@ -1081,25 +1026,7 @@
                 <w:sz w:val="18"/>
                 <w:szCs w:val="18"/>
               </w:rPr>
-              <w:t>{{</w:t>
-            </w:r>
-            <w:proofErr w:type="spellStart"/>
-            <w:r>
-              <w:rPr>
-                <w:color w:val="11437E"/>
-                <w:sz w:val="18"/>
-                <w:szCs w:val="18"/>
-              </w:rPr>
-              <w:t>length</w:t>
-            </w:r>
-            <w:proofErr w:type="spellEnd"/>
-            <w:r>
-              <w:rPr>
-                <w:color w:val="11437E"/>
-                <w:sz w:val="18"/>
-                <w:szCs w:val="18"/>
-              </w:rPr>
-              <w:t>}}</w:t>
+              <w:t>{{length}}</w:t>
             </w:r>
           </w:p>
         </w:tc>
@@ -1260,25 +1187,7 @@
                 <w:sz w:val="18"/>
                 <w:szCs w:val="18"/>
               </w:rPr>
-              <w:t>{{</w:t>
-            </w:r>
-            <w:proofErr w:type="spellStart"/>
-            <w:r>
-              <w:rPr>
-                <w:color w:val="11437E"/>
-                <w:sz w:val="18"/>
-                <w:szCs w:val="18"/>
-              </w:rPr>
-              <w:t>collaboratorname</w:t>
-            </w:r>
-            <w:proofErr w:type="spellEnd"/>
-            <w:r>
-              <w:rPr>
-                <w:color w:val="11437E"/>
-                <w:sz w:val="18"/>
-                <w:szCs w:val="18"/>
-              </w:rPr>
-              <w:t>}}</w:t>
+              <w:t>{{collaboratorname}}</w:t>
             </w:r>
           </w:p>
         </w:tc>
@@ -1304,25 +1213,7 @@
                 <w:sz w:val="18"/>
                 <w:szCs w:val="18"/>
               </w:rPr>
-              <w:t>{{</w:t>
-            </w:r>
-            <w:proofErr w:type="spellStart"/>
-            <w:r>
-              <w:rPr>
-                <w:color w:val="11437E"/>
-                <w:sz w:val="18"/>
-                <w:szCs w:val="18"/>
-              </w:rPr>
-              <w:t>collaboratorposition</w:t>
-            </w:r>
-            <w:proofErr w:type="spellEnd"/>
-            <w:r>
-              <w:rPr>
-                <w:color w:val="11437E"/>
-                <w:sz w:val="18"/>
-                <w:szCs w:val="18"/>
-              </w:rPr>
-              <w:t>}}</w:t>
+              <w:t>{{collaboratorposition}}</w:t>
             </w:r>
           </w:p>
         </w:tc>
@@ -1547,25 +1438,7 @@
                 <w:sz w:val="18"/>
                 <w:szCs w:val="18"/>
               </w:rPr>
-              <w:t xml:space="preserve"> {{</w:t>
-            </w:r>
-            <w:proofErr w:type="spellStart"/>
-            <w:r>
-              <w:rPr>
-                <w:color w:val="11437E"/>
-                <w:sz w:val="18"/>
-                <w:szCs w:val="18"/>
-              </w:rPr>
-              <w:t>startppm</w:t>
-            </w:r>
-            <w:proofErr w:type="spellEnd"/>
-            <w:r>
-              <w:rPr>
-                <w:color w:val="11437E"/>
-                <w:sz w:val="18"/>
-                <w:szCs w:val="18"/>
-              </w:rPr>
-              <w:t>}}</w:t>
+              <w:t xml:space="preserve"> {{startppm}}</w:t>
             </w:r>
           </w:p>
         </w:tc>
@@ -1626,25 +1499,7 @@
                 <w:sz w:val="18"/>
                 <w:szCs w:val="18"/>
               </w:rPr>
-              <w:t>{{</w:t>
-            </w:r>
-            <w:proofErr w:type="spellStart"/>
-            <w:r>
-              <w:rPr>
-                <w:color w:val="11437E"/>
-                <w:sz w:val="18"/>
-                <w:szCs w:val="18"/>
-              </w:rPr>
-              <w:t>startnas</w:t>
-            </w:r>
-            <w:proofErr w:type="spellEnd"/>
-            <w:r>
-              <w:rPr>
-                <w:color w:val="11437E"/>
-                <w:sz w:val="18"/>
-                <w:szCs w:val="18"/>
-              </w:rPr>
-              <w:t>}}</w:t>
+              <w:t>{{startnas}}</w:t>
             </w:r>
           </w:p>
         </w:tc>
@@ -1671,25 +1526,7 @@
                 <w:sz w:val="18"/>
                 <w:szCs w:val="18"/>
               </w:rPr>
-              <w:t>{{</w:t>
-            </w:r>
-            <w:proofErr w:type="spellStart"/>
-            <w:r>
-              <w:rPr>
-                <w:color w:val="11437E"/>
-                <w:sz w:val="18"/>
-                <w:szCs w:val="18"/>
-              </w:rPr>
-              <w:t>startiso</w:t>
-            </w:r>
-            <w:proofErr w:type="spellEnd"/>
-            <w:r>
-              <w:rPr>
-                <w:color w:val="11437E"/>
-                <w:sz w:val="18"/>
-                <w:szCs w:val="18"/>
-              </w:rPr>
-              <w:t>}}</w:t>
+              <w:t>{{startiso}}</w:t>
             </w:r>
           </w:p>
         </w:tc>
@@ -1770,25 +1607,7 @@
                 <w:sz w:val="18"/>
                 <w:szCs w:val="18"/>
               </w:rPr>
-              <w:t>{{</w:t>
-            </w:r>
-            <w:proofErr w:type="spellStart"/>
-            <w:r>
-              <w:rPr>
-                <w:color w:val="11437E"/>
-                <w:sz w:val="18"/>
-                <w:szCs w:val="18"/>
-              </w:rPr>
-              <w:t>endnas</w:t>
-            </w:r>
-            <w:proofErr w:type="spellEnd"/>
-            <w:r>
-              <w:rPr>
-                <w:color w:val="11437E"/>
-                <w:sz w:val="18"/>
-                <w:szCs w:val="18"/>
-              </w:rPr>
-              <w:t>}}</w:t>
+              <w:t>{{endnas}}</w:t>
             </w:r>
           </w:p>
         </w:tc>
@@ -1815,25 +1634,7 @@
                 <w:sz w:val="18"/>
                 <w:szCs w:val="18"/>
               </w:rPr>
-              <w:t>{{</w:t>
-            </w:r>
-            <w:proofErr w:type="spellStart"/>
-            <w:r>
-              <w:rPr>
-                <w:color w:val="11437E"/>
-                <w:sz w:val="18"/>
-                <w:szCs w:val="18"/>
-              </w:rPr>
-              <w:t>endiso</w:t>
-            </w:r>
-            <w:proofErr w:type="spellEnd"/>
-            <w:r>
-              <w:rPr>
-                <w:color w:val="11437E"/>
-                <w:sz w:val="18"/>
-                <w:szCs w:val="18"/>
-              </w:rPr>
-              <w:t>}}</w:t>
+              <w:t>{{endiso}}</w:t>
             </w:r>
           </w:p>
         </w:tc>
@@ -1872,7 +1673,6 @@
               </w:rPr>
               <w:t>{{</w:t>
             </w:r>
-            <w:proofErr w:type="spellStart"/>
             <w:r>
               <w:rPr>
                 <w:color w:val="11437E"/>
@@ -1881,7 +1681,6 @@
               </w:rPr>
               <w:t>endppm</w:t>
             </w:r>
-            <w:proofErr w:type="spellEnd"/>
             <w:r>
               <w:rPr>
                 <w:color w:val="11437E"/>
@@ -1950,25 +1749,7 @@
                 <w:sz w:val="18"/>
                 <w:szCs w:val="18"/>
               </w:rPr>
-              <w:t>{{</w:t>
-            </w:r>
-            <w:proofErr w:type="spellStart"/>
-            <w:r>
-              <w:rPr>
-                <w:color w:val="11437E"/>
-                <w:sz w:val="18"/>
-                <w:szCs w:val="18"/>
-              </w:rPr>
-              <w:t>totaltime</w:t>
-            </w:r>
-            <w:proofErr w:type="spellEnd"/>
-            <w:r>
-              <w:rPr>
-                <w:color w:val="11437E"/>
-                <w:sz w:val="18"/>
-                <w:szCs w:val="18"/>
-              </w:rPr>
-              <w:t>}}</w:t>
+              <w:t>{{totaltime}}</w:t>
             </w:r>
           </w:p>
         </w:tc>
@@ -2093,7 +1874,6 @@
               </w:rPr>
               <w:t>{{</w:t>
             </w:r>
-            <w:proofErr w:type="spellStart"/>
             <w:r>
               <w:rPr>
                 <w:color w:val="11437E"/>
@@ -2102,7 +1882,6 @@
               </w:rPr>
               <w:t>countphotos</w:t>
             </w:r>
-            <w:proofErr w:type="spellEnd"/>
             <w:r>
               <w:rPr>
                 <w:color w:val="11437E"/>
@@ -2316,7 +2095,6 @@
               </w:rPr>
               <w:t>{{</w:t>
             </w:r>
-            <w:proofErr w:type="spellStart"/>
             <w:r>
               <w:rPr>
                 <w:color w:val="11437E"/>
@@ -2325,7 +2103,6 @@
               </w:rPr>
               <w:t>humidityphotos</w:t>
             </w:r>
-            <w:proofErr w:type="spellEnd"/>
             <w:r>
               <w:rPr>
                 <w:color w:val="11437E"/>
@@ -2422,25 +2199,7 @@
                 <w:sz w:val="18"/>
                 <w:szCs w:val="18"/>
               </w:rPr>
-              <w:t>{{</w:t>
-            </w:r>
-            <w:proofErr w:type="spellStart"/>
-            <w:r>
-              <w:rPr>
-                <w:color w:val="11437E"/>
-                <w:sz w:val="18"/>
-                <w:szCs w:val="18"/>
-              </w:rPr>
-              <w:t>obs</w:t>
-            </w:r>
-            <w:proofErr w:type="spellEnd"/>
-            <w:r>
-              <w:rPr>
-                <w:color w:val="11437E"/>
-                <w:sz w:val="18"/>
-                <w:szCs w:val="18"/>
-              </w:rPr>
-              <w:t>}}</w:t>
+              <w:t>{{obs}}</w:t>
             </w:r>
           </w:p>
         </w:tc>
@@ -2545,21 +2304,7 @@
               <w:rPr>
                 <w:color w:val="11437E"/>
               </w:rPr>
-              <w:t xml:space="preserve"> {{</w:t>
-            </w:r>
-            <w:proofErr w:type="spellStart"/>
-            <w:r>
-              <w:rPr>
-                <w:color w:val="11437E"/>
-              </w:rPr>
-              <w:t>leadername</w:t>
-            </w:r>
-            <w:proofErr w:type="spellEnd"/>
-            <w:r>
-              <w:rPr>
-                <w:color w:val="11437E"/>
-              </w:rPr>
-              <w:t>}}</w:t>
+              <w:t xml:space="preserve"> {{leadername}}</w:t>
             </w:r>
           </w:p>
           <w:p>
@@ -2581,21 +2326,7 @@
               <w:rPr>
                 <w:color w:val="11437E"/>
               </w:rPr>
-              <w:t>{{</w:t>
-            </w:r>
-            <w:proofErr w:type="spellStart"/>
-            <w:r>
-              <w:rPr>
-                <w:color w:val="11437E"/>
-              </w:rPr>
-              <w:t>leaderposition</w:t>
-            </w:r>
-            <w:proofErr w:type="spellEnd"/>
-            <w:r>
-              <w:rPr>
-                <w:color w:val="11437E"/>
-              </w:rPr>
-              <w:t>}}</w:t>
+              <w:t>{{leaderposition}}</w:t>
             </w:r>
           </w:p>
         </w:tc>
@@ -3232,7 +2963,6 @@
             </w:rPr>
             <w:t>{{</w:t>
           </w:r>
-          <w:proofErr w:type="spellStart"/>
           <w:r>
             <w:rPr>
               <w:b/>
@@ -3241,7 +2971,6 @@
             </w:rPr>
             <w:t>missiontitle</w:t>
           </w:r>
-          <w:proofErr w:type="spellEnd"/>
           <w:r>
             <w:rPr>
               <w:b/>
@@ -3285,29 +3014,7 @@
               <w:sz w:val="18"/>
               <w:szCs w:val="18"/>
             </w:rPr>
-            <w:t>{{</w:t>
-          </w:r>
-          <w:proofErr w:type="spellStart"/>
-          <w:r>
-            <w:rPr>
-              <w:b/>
-              <w:bCs/>
-              <w:color w:val="11437E"/>
-              <w:sz w:val="18"/>
-              <w:szCs w:val="18"/>
-            </w:rPr>
-            <w:t>client</w:t>
-          </w:r>
-          <w:proofErr w:type="spellEnd"/>
-          <w:r>
-            <w:rPr>
-              <w:b/>
-              <w:bCs/>
-              <w:color w:val="11437E"/>
-              <w:sz w:val="18"/>
-              <w:szCs w:val="18"/>
-            </w:rPr>
-            <w:t>}}</w:t>
+            <w:t>{{client}}</w:t>
           </w:r>
         </w:p>
       </w:tc>
@@ -3335,29 +3042,7 @@
               <w:sz w:val="18"/>
               <w:szCs w:val="18"/>
             </w:rPr>
-            <w:t>{{</w:t>
-          </w:r>
-          <w:proofErr w:type="spellStart"/>
-          <w:r>
-            <w:rPr>
-              <w:b/>
-              <w:bCs/>
-              <w:color w:val="11437E"/>
-              <w:sz w:val="18"/>
-              <w:szCs w:val="18"/>
-            </w:rPr>
-            <w:t>proposal</w:t>
-          </w:r>
-          <w:proofErr w:type="spellEnd"/>
-          <w:r>
-            <w:rPr>
-              <w:b/>
-              <w:bCs/>
-              <w:color w:val="11437E"/>
-              <w:sz w:val="18"/>
-              <w:szCs w:val="18"/>
-            </w:rPr>
-            <w:t>}}</w:t>
+            <w:t>{{proposal}}</w:t>
           </w:r>
         </w:p>
       </w:tc>
@@ -3405,7 +3090,6 @@
             </w:rPr>
             <w:t>{{</w:t>
           </w:r>
-          <w:proofErr w:type="spellStart"/>
           <w:r>
             <w:rPr>
               <w:b/>
@@ -3414,18 +3098,7 @@
               <w:sz w:val="18"/>
               <w:szCs w:val="18"/>
             </w:rPr>
-            <w:t>rcpu</w:t>
-          </w:r>
-          <w:proofErr w:type="spellEnd"/>
-          <w:r>
-            <w:rPr>
-              <w:b/>
-              <w:bCs/>
-              <w:color w:val="11437E"/>
-              <w:sz w:val="18"/>
-              <w:szCs w:val="18"/>
-            </w:rPr>
-            <w:t>}</w:t>
+            <w:t>rcpu}</w:t>
           </w:r>
           <w:r>
             <w:rPr>
@@ -3469,29 +3142,7 @@
               <w:sz w:val="18"/>
               <w:szCs w:val="18"/>
             </w:rPr>
-            <w:t xml:space="preserve"> {{</w:t>
-          </w:r>
-          <w:proofErr w:type="spellStart"/>
-          <w:r>
-            <w:rPr>
-              <w:b/>
-              <w:bCs/>
-              <w:color w:val="11437E"/>
-              <w:sz w:val="18"/>
-              <w:szCs w:val="18"/>
-            </w:rPr>
-            <w:t>cnpj</w:t>
-          </w:r>
-          <w:proofErr w:type="spellEnd"/>
-          <w:r>
-            <w:rPr>
-              <w:b/>
-              <w:bCs/>
-              <w:color w:val="11437E"/>
-              <w:sz w:val="18"/>
-              <w:szCs w:val="18"/>
-            </w:rPr>
-            <w:t>}}</w:t>
+            <w:t xml:space="preserve"> {{cnpj}}</w:t>
           </w:r>
         </w:p>
       </w:tc>

</xml_diff>